<commit_message>
Remove Lessons Learned section from print edition and styled Word report
Co-Authored-By: Claude Sonnet 5.5 <noreply@anthropic.com>
Claude-Session: https://claude.ai/code/session_01B6RPWkBpLKoctTdaNtAabD
</commit_message>
<xml_diff>
--- a/Rasmi_Event_Management_Report_HoA_DRIVE_styled.docx
+++ b/Rasmi_Event_Management_Report_HoA_DRIVE_styled.docx
@@ -6333,109 +6333,7 @@
         <w:pStyle w:val="Heading1"/>
       </w:pPr>
       <w:r>
-        <w:t>8. Lessons Learned and Recommendations</w:t>
-      </w:r>
-    </w:p>
-    <w:p>
-      <w:pPr>
-        <w:pStyle w:val="Heading2"/>
-      </w:pPr>
-      <w:r>
-        <w:t>What worked well</w:t>
-      </w:r>
-    </w:p>
-    <w:p>
-      <w:pPr>
-        <w:pStyle w:val="ListParagraph"/>
-        <w:numPr>
-          <w:ilvl w:val="0"/>
-          <w:numId w:val="2"/>
-        </w:numPr>
-        <w:spacing w:after="60"/>
-      </w:pPr>
-      <w:r>
-        <w:t>A standard service checklist for every district.</w:t>
-      </w:r>
-    </w:p>
-    <w:p>
-      <w:pPr>
-        <w:pStyle w:val="ListParagraph"/>
-        <w:numPr>
-          <w:ilvl w:val="0"/>
-          <w:numId w:val="2"/>
-        </w:numPr>
-        <w:spacing w:after="60"/>
-      </w:pPr>
-      <w:r>
-        <w:t>Planning each ceremony as its own deployment.</w:t>
-      </w:r>
-    </w:p>
-    <w:p>
-      <w:pPr>
-        <w:pStyle w:val="ListParagraph"/>
-        <w:numPr>
-          <w:ilvl w:val="0"/>
-          <w:numId w:val="2"/>
-        </w:numPr>
-        <w:spacing w:after="60"/>
-      </w:pPr>
-      <w:r>
-        <w:t>Helping families carry their fridges on the day.</w:t>
-      </w:r>
-    </w:p>
-    <w:p>
-      <w:pPr>
-        <w:pStyle w:val="Heading2"/>
-      </w:pPr>
-      <w:r>
-        <w:t>For future handovers</w:t>
-      </w:r>
-    </w:p>
-    <w:p>
-      <w:pPr>
-        <w:pStyle w:val="ListParagraph"/>
-        <w:numPr>
-          <w:ilvl w:val="0"/>
-          <w:numId w:val="2"/>
-        </w:numPr>
-        <w:spacing w:after="60"/>
-      </w:pPr>
-      <w:r>
-        <w:t>Agree the district schedule with the PIU early.</w:t>
-      </w:r>
-    </w:p>
-    <w:p>
-      <w:pPr>
-        <w:pStyle w:val="ListParagraph"/>
-        <w:numPr>
-          <w:ilvl w:val="0"/>
-          <w:numId w:val="2"/>
-        </w:numPr>
-        <w:spacing w:after="60"/>
-      </w:pPr>
-      <w:r>
-        <w:t>Confirm venue, transport type and any catering per district in advance.</w:t>
-      </w:r>
-    </w:p>
-    <w:p>
-      <w:pPr>
-        <w:pStyle w:val="ListParagraph"/>
-        <w:numPr>
-          <w:ilvl w:val="0"/>
-          <w:numId w:val="2"/>
-        </w:numPr>
-        <w:spacing w:after="60"/>
-      </w:pPr>
-      <w:r>
-        <w:t>Share media coverage with the PIU within a set number of days after each ceremony.</w:t>
-      </w:r>
-    </w:p>
-    <w:p>
-      <w:pPr>
-        <w:pStyle w:val="Heading1"/>
-      </w:pPr>
-      <w:r>
-        <w:t>9. Conclusion</w:t>
+        <w:t>8. Conclusion</w:t>
       </w:r>
     </w:p>
     <w:p>

</xml_diff>